<commit_message>
Align resumes and portfolio with experience
</commit_message>
<xml_diff>
--- a/public/Namri_Amine_Resume.docx
+++ b/public/Namri_Amine_Resume.docx
@@ -231,7 +231,6 @@
     <w:p>
       <w:pPr>
         <w:pStyle w:val="Heading2"/>
-        <w:keepNext/>
         <w:spacing w:before="240" w:line="480" w:lineRule="auto"/>
         <w:ind w:left="176"/>
       </w:pPr>
@@ -369,7 +368,16 @@
           <w:sz w:val="20"/>
           <w:szCs w:val="20"/>
         </w:rPr>
-        <w:t>6+</w:t>
+        <w:t>5</w:t>
+      </w:r>
+      <w:r>
+        <w:rPr>
+          <w:rFonts w:ascii="Arial" w:hAnsi="Arial" w:cs="Arial"/>
+          <w:color w:val="1D283B"/>
+          <w:sz w:val="20"/>
+          <w:szCs w:val="20"/>
+        </w:rPr>
+        <w:t>+</w:t>
       </w:r>
       <w:r>
         <w:rPr>
@@ -956,7 +964,6 @@
     <w:p>
       <w:pPr>
         <w:pStyle w:val="Heading2"/>
-        <w:keepNext/>
         <w:spacing w:before="240" w:line="480" w:lineRule="auto"/>
         <w:ind w:left="176"/>
         <w:rPr>
@@ -1123,6 +1130,30 @@
       </w:pPr>
       <w:r>
         <w:rPr>
+          <w:b/>
+        </w:rPr>
+        <w:t xml:space="preserve">Backend: </w:t>
+      </w:r>
+      <w:r>
+        <w:rPr>
+          <w:b w:val="0"/>
+        </w:rPr>
+        <w:t>Node.js, Express, FastAPI, Django, REST APIs, BullMQ Pro, Celery</w:t>
+      </w:r>
+    </w:p>
+    <w:p>
+      <w:pPr>
+        <w:spacing w:before="2" w:line="276" w:lineRule="auto"/>
+        <w:ind w:left="177"/>
+        <w:rPr>
+          <w:rFonts w:ascii="Arial" w:hAnsi="Arial" w:cs="Arial"/>
+          <w:color w:val="334154"/>
+          <w:sz w:val="20"/>
+          <w:szCs w:val="20"/>
+        </w:rPr>
+      </w:pPr>
+      <w:r>
+        <w:rPr>
           <w:rFonts w:ascii="Arial" w:hAnsi="Arial" w:cs="Arial"/>
           <w:b/>
           <w:bCs/>
@@ -1130,16 +1161,16 @@
           <w:sz w:val="20"/>
           <w:szCs w:val="20"/>
         </w:rPr>
-        <w:t>Backend:</w:t>
-      </w:r>
-      <w:r>
-        <w:rPr>
-          <w:rFonts w:ascii="Arial" w:hAnsi="Arial" w:cs="Arial"/>
-          <w:color w:val="334154"/>
-          <w:sz w:val="20"/>
-          <w:szCs w:val="20"/>
-        </w:rPr>
-        <w:t xml:space="preserve"> Node.js, Express, </w:t>
+        <w:t>Databases &amp; Auth:</w:t>
+      </w:r>
+      <w:r>
+        <w:rPr>
+          <w:rFonts w:ascii="Arial" w:hAnsi="Arial" w:cs="Arial"/>
+          <w:color w:val="334154"/>
+          <w:sz w:val="20"/>
+          <w:szCs w:val="20"/>
+        </w:rPr>
+        <w:t xml:space="preserve"> PostgreSQL, MySQL, MongoDB, Prisma ORM, </w:t>
       </w:r>
       <w:proofErr w:type="spellStart"/>
       <w:r>
@@ -1149,7 +1180,7 @@
           <w:sz w:val="20"/>
           <w:szCs w:val="20"/>
         </w:rPr>
-        <w:t>FastAPI</w:t>
+        <w:t>Supabase</w:t>
       </w:r>
       <w:proofErr w:type="spellEnd"/>
       <w:r>
@@ -1159,27 +1190,7 @@
           <w:sz w:val="20"/>
           <w:szCs w:val="20"/>
         </w:rPr>
-        <w:t xml:space="preserve">, REST APIs, Socket.IO, </w:t>
-      </w:r>
-      <w:proofErr w:type="spellStart"/>
-      <w:r>
-        <w:rPr>
-          <w:rFonts w:ascii="Arial" w:hAnsi="Arial" w:cs="Arial"/>
-          <w:color w:val="334154"/>
-          <w:sz w:val="20"/>
-          <w:szCs w:val="20"/>
-        </w:rPr>
-        <w:t>BullMQ</w:t>
-      </w:r>
-      <w:proofErr w:type="spellEnd"/>
-      <w:r>
-        <w:rPr>
-          <w:rFonts w:ascii="Arial" w:hAnsi="Arial" w:cs="Arial"/>
-          <w:color w:val="334154"/>
-          <w:sz w:val="20"/>
-          <w:szCs w:val="20"/>
-        </w:rPr>
-        <w:t xml:space="preserve"> Pro, Celery</w:t>
+        <w:t>, Firebase, Better Auth, JWT/OAuth</w:t>
       </w:r>
     </w:p>
     <w:p>
@@ -1188,7 +1199,6 @@
         <w:ind w:left="177"/>
         <w:rPr>
           <w:rFonts w:ascii="Arial" w:hAnsi="Arial" w:cs="Arial"/>
-          <w:color w:val="334154"/>
           <w:sz w:val="20"/>
           <w:szCs w:val="20"/>
         </w:rPr>
@@ -1202,16 +1212,16 @@
           <w:sz w:val="20"/>
           <w:szCs w:val="20"/>
         </w:rPr>
-        <w:t>Databases &amp; Auth:</w:t>
-      </w:r>
-      <w:r>
-        <w:rPr>
-          <w:rFonts w:ascii="Arial" w:hAnsi="Arial" w:cs="Arial"/>
-          <w:color w:val="334154"/>
-          <w:sz w:val="20"/>
-          <w:szCs w:val="20"/>
-        </w:rPr>
-        <w:t xml:space="preserve"> PostgreSQL, MySQL, MongoDB, Prisma ORM, </w:t>
+        <w:t>Storage/CDN/Queues:</w:t>
+      </w:r>
+      <w:r>
+        <w:rPr>
+          <w:rFonts w:ascii="Arial" w:hAnsi="Arial" w:cs="Arial"/>
+          <w:color w:val="334154"/>
+          <w:sz w:val="20"/>
+          <w:szCs w:val="20"/>
+        </w:rPr>
+        <w:t xml:space="preserve"> Redis, Bunny CDN, </w:t>
       </w:r>
       <w:proofErr w:type="spellStart"/>
       <w:r>
@@ -1231,7 +1241,161 @@
           <w:sz w:val="20"/>
           <w:szCs w:val="20"/>
         </w:rPr>
-        <w:t>, Firebase, Better Auth, JWT/OAuth</w:t>
+        <w:t xml:space="preserve"> Storage, Sharp, </w:t>
+      </w:r>
+      <w:proofErr w:type="spellStart"/>
+      <w:r>
+        <w:rPr>
+          <w:rFonts w:ascii="Arial" w:hAnsi="Arial" w:cs="Arial"/>
+          <w:color w:val="334154"/>
+          <w:sz w:val="20"/>
+          <w:szCs w:val="20"/>
+        </w:rPr>
+        <w:t>resvg-js</w:t>
+      </w:r>
+      <w:proofErr w:type="spellEnd"/>
+      <w:r>
+        <w:rPr>
+          <w:rFonts w:ascii="Arial" w:hAnsi="Arial" w:cs="Arial"/>
+          <w:color w:val="334154"/>
+          <w:sz w:val="20"/>
+          <w:szCs w:val="20"/>
+        </w:rPr>
+        <w:t>, Multer</w:t>
+      </w:r>
+    </w:p>
+    <w:p>
+      <w:pPr>
+        <w:spacing w:before="2" w:line="276" w:lineRule="auto"/>
+        <w:ind w:left="177" w:right="533"/>
+        <w:rPr>
+          <w:rFonts w:ascii="Arial" w:hAnsi="Arial" w:cs="Arial"/>
+          <w:color w:val="334154"/>
+          <w:sz w:val="20"/>
+          <w:szCs w:val="20"/>
+        </w:rPr>
+      </w:pPr>
+      <w:r>
+        <w:rPr>
+          <w:rFonts w:ascii="Arial" w:hAnsi="Arial" w:cs="Arial"/>
+          <w:b/>
+          <w:bCs/>
+          <w:color w:val="334154"/>
+          <w:sz w:val="20"/>
+          <w:szCs w:val="20"/>
+        </w:rPr>
+        <w:t>DevOps &amp; Quality:</w:t>
+      </w:r>
+      <w:r>
+        <w:rPr>
+          <w:rFonts w:ascii="Arial" w:hAnsi="Arial" w:cs="Arial"/>
+          <w:color w:val="334154"/>
+          <w:sz w:val="20"/>
+          <w:szCs w:val="20"/>
+        </w:rPr>
+        <w:t xml:space="preserve"> Git, GitLab/GitHub CI, Docker, </w:t>
+      </w:r>
+      <w:proofErr w:type="spellStart"/>
+      <w:r>
+        <w:rPr>
+          <w:rFonts w:ascii="Arial" w:hAnsi="Arial" w:cs="Arial"/>
+          <w:color w:val="334154"/>
+          <w:sz w:val="20"/>
+          <w:szCs w:val="20"/>
+        </w:rPr>
+        <w:t>Vercel</w:t>
+      </w:r>
+      <w:proofErr w:type="spellEnd"/>
+      <w:r>
+        <w:rPr>
+          <w:rFonts w:ascii="Arial" w:hAnsi="Arial" w:cs="Arial"/>
+          <w:color w:val="334154"/>
+          <w:sz w:val="20"/>
+          <w:szCs w:val="20"/>
+        </w:rPr>
+        <w:t xml:space="preserve">, Linux, Nginx, Playwright E2E, Jest, </w:t>
+      </w:r>
+      <w:proofErr w:type="spellStart"/>
+      <w:r>
+        <w:rPr>
+          <w:rFonts w:ascii="Arial" w:hAnsi="Arial" w:cs="Arial"/>
+          <w:color w:val="334154"/>
+          <w:sz w:val="20"/>
+          <w:szCs w:val="20"/>
+        </w:rPr>
+        <w:t>pytest</w:t>
+      </w:r>
+      <w:proofErr w:type="spellEnd"/>
+      <w:r>
+        <w:rPr>
+          <w:rFonts w:ascii="Arial" w:hAnsi="Arial" w:cs="Arial"/>
+          <w:color w:val="334154"/>
+          <w:sz w:val="20"/>
+          <w:szCs w:val="20"/>
+        </w:rPr>
+        <w:t xml:space="preserve">, </w:t>
+      </w:r>
+      <w:proofErr w:type="spellStart"/>
+      <w:r>
+        <w:rPr>
+          <w:rFonts w:ascii="Arial" w:hAnsi="Arial" w:cs="Arial"/>
+          <w:color w:val="334154"/>
+          <w:sz w:val="20"/>
+          <w:szCs w:val="20"/>
+        </w:rPr>
+        <w:t>Vitest</w:t>
+      </w:r>
+      <w:proofErr w:type="spellEnd"/>
+    </w:p>
+    <w:p>
+      <w:pPr>
+        <w:spacing w:before="2" w:line="276" w:lineRule="auto"/>
+        <w:ind w:left="177" w:right="533"/>
+        <w:rPr>
+          <w:rFonts w:ascii="Arial" w:hAnsi="Arial" w:cs="Arial"/>
+          <w:sz w:val="20"/>
+          <w:szCs w:val="20"/>
+        </w:rPr>
+      </w:pPr>
+      <w:r>
+        <w:rPr>
+          <w:rFonts w:ascii="Arial" w:hAnsi="Arial" w:cs="Arial"/>
+          <w:b/>
+          <w:bCs/>
+          <w:color w:val="334154"/>
+          <w:sz w:val="20"/>
+          <w:szCs w:val="20"/>
+        </w:rPr>
+        <w:t>Practices:</w:t>
+      </w:r>
+      <w:r>
+        <w:rPr>
+          <w:rFonts w:ascii="Arial" w:hAnsi="Arial" w:cs="Arial"/>
+          <w:color w:val="334154"/>
+          <w:sz w:val="20"/>
+          <w:szCs w:val="20"/>
+        </w:rPr>
+        <w:t xml:space="preserve"> Agile/Scrum, Code Review, WCAG Accessibility, TypeScript Strict, </w:t>
+      </w:r>
+      <w:proofErr w:type="spellStart"/>
+      <w:r>
+        <w:rPr>
+          <w:rFonts w:ascii="Arial" w:hAnsi="Arial" w:cs="Arial"/>
+          <w:color w:val="334154"/>
+          <w:sz w:val="20"/>
+          <w:szCs w:val="20"/>
+        </w:rPr>
+        <w:t>ESLint</w:t>
+      </w:r>
+      <w:proofErr w:type="spellEnd"/>
+      <w:r>
+        <w:rPr>
+          <w:rFonts w:ascii="Arial" w:hAnsi="Arial" w:cs="Arial"/>
+          <w:color w:val="334154"/>
+          <w:sz w:val="20"/>
+          <w:szCs w:val="20"/>
+        </w:rPr>
+        <w:t>, Prettier</w:t>
       </w:r>
     </w:p>
     <w:p>
@@ -1253,211 +1417,6 @@
           <w:sz w:val="20"/>
           <w:szCs w:val="20"/>
         </w:rPr>
-        <w:t>Storage/CDN/Queues:</w:t>
-      </w:r>
-      <w:r>
-        <w:rPr>
-          <w:rFonts w:ascii="Arial" w:hAnsi="Arial" w:cs="Arial"/>
-          <w:color w:val="334154"/>
-          <w:sz w:val="20"/>
-          <w:szCs w:val="20"/>
-        </w:rPr>
-        <w:t xml:space="preserve"> Redis, Bunny CDN, </w:t>
-      </w:r>
-      <w:proofErr w:type="spellStart"/>
-      <w:r>
-        <w:rPr>
-          <w:rFonts w:ascii="Arial" w:hAnsi="Arial" w:cs="Arial"/>
-          <w:color w:val="334154"/>
-          <w:sz w:val="20"/>
-          <w:szCs w:val="20"/>
-        </w:rPr>
-        <w:t>Supabase</w:t>
-      </w:r>
-      <w:proofErr w:type="spellEnd"/>
-      <w:r>
-        <w:rPr>
-          <w:rFonts w:ascii="Arial" w:hAnsi="Arial" w:cs="Arial"/>
-          <w:color w:val="334154"/>
-          <w:sz w:val="20"/>
-          <w:szCs w:val="20"/>
-        </w:rPr>
-        <w:t xml:space="preserve"> Storage, Sharp, </w:t>
-      </w:r>
-      <w:proofErr w:type="spellStart"/>
-      <w:r>
-        <w:rPr>
-          <w:rFonts w:ascii="Arial" w:hAnsi="Arial" w:cs="Arial"/>
-          <w:color w:val="334154"/>
-          <w:sz w:val="20"/>
-          <w:szCs w:val="20"/>
-        </w:rPr>
-        <w:t>resvg-js</w:t>
-      </w:r>
-      <w:proofErr w:type="spellEnd"/>
-      <w:r>
-        <w:rPr>
-          <w:rFonts w:ascii="Arial" w:hAnsi="Arial" w:cs="Arial"/>
-          <w:color w:val="334154"/>
-          <w:sz w:val="20"/>
-          <w:szCs w:val="20"/>
-        </w:rPr>
-        <w:t>, Multer</w:t>
-      </w:r>
-    </w:p>
-    <w:p>
-      <w:pPr>
-        <w:spacing w:before="2" w:line="276" w:lineRule="auto"/>
-        <w:ind w:left="177" w:right="533"/>
-        <w:rPr>
-          <w:rFonts w:ascii="Arial" w:hAnsi="Arial" w:cs="Arial"/>
-          <w:color w:val="334154"/>
-          <w:sz w:val="20"/>
-          <w:szCs w:val="20"/>
-        </w:rPr>
-      </w:pPr>
-      <w:r>
-        <w:rPr>
-          <w:rFonts w:ascii="Arial" w:hAnsi="Arial" w:cs="Arial"/>
-          <w:b/>
-          <w:bCs/>
-          <w:color w:val="334154"/>
-          <w:sz w:val="20"/>
-          <w:szCs w:val="20"/>
-        </w:rPr>
-        <w:t>DevOps &amp; Quality:</w:t>
-      </w:r>
-      <w:r>
-        <w:rPr>
-          <w:rFonts w:ascii="Arial" w:hAnsi="Arial" w:cs="Arial"/>
-          <w:color w:val="334154"/>
-          <w:sz w:val="20"/>
-          <w:szCs w:val="20"/>
-        </w:rPr>
-        <w:t xml:space="preserve"> Git, GitLab/GitHub CI, Docker, </w:t>
-      </w:r>
-      <w:proofErr w:type="spellStart"/>
-      <w:r>
-        <w:rPr>
-          <w:rFonts w:ascii="Arial" w:hAnsi="Arial" w:cs="Arial"/>
-          <w:color w:val="334154"/>
-          <w:sz w:val="20"/>
-          <w:szCs w:val="20"/>
-        </w:rPr>
-        <w:t>Vercel</w:t>
-      </w:r>
-      <w:proofErr w:type="spellEnd"/>
-      <w:r>
-        <w:rPr>
-          <w:rFonts w:ascii="Arial" w:hAnsi="Arial" w:cs="Arial"/>
-          <w:color w:val="334154"/>
-          <w:sz w:val="20"/>
-          <w:szCs w:val="20"/>
-        </w:rPr>
-        <w:t xml:space="preserve">, Linux, Nginx, Playwright E2E, Jest, </w:t>
-      </w:r>
-      <w:proofErr w:type="spellStart"/>
-      <w:r>
-        <w:rPr>
-          <w:rFonts w:ascii="Arial" w:hAnsi="Arial" w:cs="Arial"/>
-          <w:color w:val="334154"/>
-          <w:sz w:val="20"/>
-          <w:szCs w:val="20"/>
-        </w:rPr>
-        <w:t>pytest</w:t>
-      </w:r>
-      <w:proofErr w:type="spellEnd"/>
-      <w:r>
-        <w:rPr>
-          <w:rFonts w:ascii="Arial" w:hAnsi="Arial" w:cs="Arial"/>
-          <w:color w:val="334154"/>
-          <w:sz w:val="20"/>
-          <w:szCs w:val="20"/>
-        </w:rPr>
-        <w:t xml:space="preserve">, </w:t>
-      </w:r>
-      <w:proofErr w:type="spellStart"/>
-      <w:r>
-        <w:rPr>
-          <w:rFonts w:ascii="Arial" w:hAnsi="Arial" w:cs="Arial"/>
-          <w:color w:val="334154"/>
-          <w:sz w:val="20"/>
-          <w:szCs w:val="20"/>
-        </w:rPr>
-        <w:t>Vitest</w:t>
-      </w:r>
-      <w:proofErr w:type="spellEnd"/>
-    </w:p>
-    <w:p>
-      <w:pPr>
-        <w:spacing w:before="2" w:line="276" w:lineRule="auto"/>
-        <w:ind w:left="177" w:right="533"/>
-        <w:rPr>
-          <w:rFonts w:ascii="Arial" w:hAnsi="Arial" w:cs="Arial"/>
-          <w:sz w:val="20"/>
-          <w:szCs w:val="20"/>
-        </w:rPr>
-      </w:pPr>
-      <w:r>
-        <w:rPr>
-          <w:rFonts w:ascii="Arial" w:hAnsi="Arial" w:cs="Arial"/>
-          <w:b/>
-          <w:bCs/>
-          <w:color w:val="334154"/>
-          <w:sz w:val="20"/>
-          <w:szCs w:val="20"/>
-        </w:rPr>
-        <w:t>Practices:</w:t>
-      </w:r>
-      <w:r>
-        <w:rPr>
-          <w:rFonts w:ascii="Arial" w:hAnsi="Arial" w:cs="Arial"/>
-          <w:color w:val="334154"/>
-          <w:sz w:val="20"/>
-          <w:szCs w:val="20"/>
-        </w:rPr>
-        <w:t xml:space="preserve"> Agile/Scrum, Code Review, WCAG Accessibility, TypeScript Strict, </w:t>
-      </w:r>
-      <w:proofErr w:type="spellStart"/>
-      <w:r>
-        <w:rPr>
-          <w:rFonts w:ascii="Arial" w:hAnsi="Arial" w:cs="Arial"/>
-          <w:color w:val="334154"/>
-          <w:sz w:val="20"/>
-          <w:szCs w:val="20"/>
-        </w:rPr>
-        <w:t>ESLint</w:t>
-      </w:r>
-      <w:proofErr w:type="spellEnd"/>
-      <w:r>
-        <w:rPr>
-          <w:rFonts w:ascii="Arial" w:hAnsi="Arial" w:cs="Arial"/>
-          <w:color w:val="334154"/>
-          <w:sz w:val="20"/>
-          <w:szCs w:val="20"/>
-        </w:rPr>
-        <w:t>, Prettier</w:t>
-      </w:r>
-    </w:p>
-    <w:p>
-      <w:pPr>
-        <w:spacing w:before="2" w:line="276" w:lineRule="auto"/>
-        <w:ind w:left="177"/>
-        <w:rPr>
-          <w:rFonts w:ascii="Arial" w:hAnsi="Arial" w:cs="Arial"/>
-          <w:sz w:val="20"/>
-          <w:szCs w:val="20"/>
-        </w:rPr>
-      </w:pPr>
-      <w:r>
-        <w:rPr>
-          <w:rFonts w:ascii="Arial" w:hAnsi="Arial" w:cs="Arial"/>
-          <w:b/>
-          <w:bCs/>
-          <w:color w:val="334154"/>
-          <w:sz w:val="20"/>
-          <w:szCs w:val="20"/>
-        </w:rPr>
         <w:t>Languages:</w:t>
       </w:r>
       <w:r>
@@ -1579,7 +1538,6 @@
     <w:p>
       <w:pPr>
         <w:pStyle w:val="Heading2"/>
-        <w:keepNext/>
         <w:spacing w:before="240" w:line="480" w:lineRule="auto"/>
         <w:ind w:left="176"/>
       </w:pPr>
@@ -1782,7 +1740,25 @@
           <w:sz w:val="20"/>
           <w:szCs w:val="20"/>
         </w:rPr>
-        <w:t>Architected a GenAI-powered brand import pipeline leveraging Google Gemini for automated content analysis, integrating external scraping tools (</w:t>
+        <w:t>Contributed to</w:t>
+      </w:r>
+      <w:r>
+        <w:rPr>
+          <w:rFonts w:ascii="Arial" w:hAnsi="Arial" w:cs="Arial"/>
+          <w:color w:val="1D283B"/>
+          <w:sz w:val="20"/>
+          <w:szCs w:val="20"/>
+        </w:rPr>
+        <w:t xml:space="preserve"> </w:t>
+      </w:r>
+      <w:r>
+        <w:rPr>
+          <w:rFonts w:ascii="Arial" w:hAnsi="Arial" w:cs="Arial"/>
+          <w:color w:val="1D283B"/>
+          <w:sz w:val="20"/>
+          <w:szCs w:val="20"/>
+        </w:rPr>
+        <w:t>a GenAI-powered brand import pipeline leveraging Google Gemini for automated content analysis, integrating external scraping tools (</w:t>
       </w:r>
       <w:proofErr w:type="spellStart"/>
       <w:r>
@@ -1871,7 +1847,34 @@
           <w:sz w:val="20"/>
           <w:szCs w:val="20"/>
         </w:rPr>
-        <w:t xml:space="preserve">Developed a comprehensive media asset library featuring batch drag-and-drop uploads, client-side deduplication, and automated server-side image conversion (SVG to PNG) via Sharp and </w:t>
+        <w:t>Developed a comprehensive media asset library featuring batch drag-and-drop uploads,</w:t>
+      </w:r>
+      <w:r>
+        <w:rPr>
+          <w:rFonts w:ascii="Arial" w:hAnsi="Arial" w:cs="Arial"/>
+          <w:color w:val="1D283B"/>
+          <w:sz w:val="20"/>
+          <w:szCs w:val="20"/>
+        </w:rPr>
+        <w:t xml:space="preserve"> </w:t>
+      </w:r>
+      <w:r>
+        <w:rPr>
+          <w:rFonts w:ascii="Arial" w:hAnsi="Arial" w:cs="Arial"/>
+          <w:color w:val="1D283B"/>
+          <w:sz w:val="20"/>
+          <w:szCs w:val="20"/>
+        </w:rPr>
+        <w:t>content-hash deduplication</w:t>
+      </w:r>
+      <w:r>
+        <w:rPr>
+          <w:rFonts w:ascii="Arial" w:hAnsi="Arial" w:cs="Arial"/>
+          <w:color w:val="1D283B"/>
+          <w:sz w:val="20"/>
+          <w:szCs w:val="20"/>
+        </w:rPr>
+        <w:t xml:space="preserve">, and automated server-side image conversion (SVG to PNG) via Sharp and </w:t>
       </w:r>
       <w:proofErr w:type="spellStart"/>
       <w:r>
@@ -2015,7 +2018,6 @@
     <w:p>
       <w:pPr>
         <w:pStyle w:val="Caption"/>
-        <w:keepNext/>
         <w:spacing w:before="120" w:line="360" w:lineRule="auto"/>
         <w:ind w:left="176"/>
       </w:pPr>
@@ -2219,11 +2221,10 @@
         <w:rPr>
           <w:rFonts w:ascii="Arial" w:hAnsi="Arial" w:cs="Arial"/>
           <w:color w:val="334154"/>
-          <w:spacing w:val="-2"/>
-          <w:sz w:val="20"/>
-          <w:szCs w:val="20"/>
-        </w:rPr>
-        <w:t>Present</w:t>
+          <w:sz w:val="20"/>
+          <w:szCs w:val="20"/>
+        </w:rPr>
+        <w:t>August 2026</w:t>
       </w:r>
     </w:p>
     <w:p>
@@ -2534,85 +2535,8 @@
         </w:rPr>
       </w:pPr>
       <w:r>
-        <w:rPr>
-          <w:rFonts w:ascii="Arial" w:hAnsi="Arial" w:cs="Arial"/>
-          <w:color w:val="334154"/>
-          <w:sz w:val="20"/>
-          <w:szCs w:val="20"/>
-        </w:rPr>
-        <w:t xml:space="preserve">Stack: Next.js 16, React 19, TypeScript, </w:t>
-      </w:r>
-      <w:proofErr w:type="spellStart"/>
-      <w:r>
-        <w:rPr>
-          <w:rFonts w:ascii="Arial" w:hAnsi="Arial" w:cs="Arial"/>
-          <w:color w:val="334154"/>
-          <w:sz w:val="20"/>
-          <w:szCs w:val="20"/>
-        </w:rPr>
-        <w:t>FastAPI</w:t>
-      </w:r>
-      <w:proofErr w:type="spellEnd"/>
-      <w:r>
-        <w:rPr>
-          <w:rFonts w:ascii="Arial" w:hAnsi="Arial" w:cs="Arial"/>
-          <w:color w:val="334154"/>
-          <w:sz w:val="20"/>
-          <w:szCs w:val="20"/>
-        </w:rPr>
-        <w:t xml:space="preserve">, PostgreSQL, Prisma, Better Auth, Celery, Redis, YOLOv8, ONNX Runtime, OpenCV, </w:t>
-      </w:r>
-      <w:proofErr w:type="spellStart"/>
-      <w:r>
-        <w:rPr>
-          <w:rFonts w:ascii="Arial" w:hAnsi="Arial" w:cs="Arial"/>
-          <w:color w:val="334154"/>
-          <w:sz w:val="20"/>
-          <w:szCs w:val="20"/>
-        </w:rPr>
-        <w:t>PyProj</w:t>
-      </w:r>
-      <w:proofErr w:type="spellEnd"/>
-      <w:r>
-        <w:rPr>
-          <w:rFonts w:ascii="Arial" w:hAnsi="Arial" w:cs="Arial"/>
-          <w:color w:val="334154"/>
-          <w:sz w:val="20"/>
-          <w:szCs w:val="20"/>
-        </w:rPr>
-        <w:t xml:space="preserve">, </w:t>
-      </w:r>
-      <w:proofErr w:type="spellStart"/>
-      <w:r>
-        <w:rPr>
-          <w:rFonts w:ascii="Arial" w:hAnsi="Arial" w:cs="Arial"/>
-          <w:color w:val="334154"/>
-          <w:sz w:val="20"/>
-          <w:szCs w:val="20"/>
-        </w:rPr>
-        <w:t>MapLibre</w:t>
-      </w:r>
-      <w:proofErr w:type="spellEnd"/>
-      <w:r>
-        <w:rPr>
-          <w:rFonts w:ascii="Arial" w:hAnsi="Arial" w:cs="Arial"/>
-          <w:color w:val="334154"/>
-          <w:sz w:val="20"/>
-          <w:szCs w:val="20"/>
-        </w:rPr>
-        <w:t xml:space="preserve"> GL, React </w:t>
-      </w:r>
-      <w:proofErr w:type="spellStart"/>
-      <w:r>
-        <w:rPr>
-          <w:rFonts w:ascii="Arial" w:hAnsi="Arial" w:cs="Arial"/>
-          <w:color w:val="334154"/>
-          <w:sz w:val="20"/>
-          <w:szCs w:val="20"/>
-        </w:rPr>
-        <w:t>Konva</w:t>
-      </w:r>
-      <w:proofErr w:type="spellEnd"/>
+        <w:t>Stack: Next.js 16, React 19, TypeScript, FastAPI, PostgreSQL, Prisma, YOLOv8/ONNX, OpenCV</w:t>
+      </w:r>
     </w:p>
     <w:p>
       <w:pPr>
@@ -2814,7 +2738,6 @@
     <w:p>
       <w:pPr>
         <w:pStyle w:val="Caption"/>
-        <w:keepNext/>
         <w:spacing w:before="120" w:line="360" w:lineRule="auto"/>
         <w:ind w:left="176"/>
         <w:rPr>
@@ -2822,17 +2745,14 @@
         </w:rPr>
       </w:pPr>
       <w:r>
-        <w:t>Full-Stack</w:t>
+        <w:t>Full-Stack Engineer</w:t>
       </w:r>
       <w:r>
         <w:rPr>
           <w:spacing w:val="-8"/>
         </w:rPr>
-        <w:t xml:space="preserve"> </w:t>
-      </w:r>
-      <w:r>
-        <w:t>Developer</w:t>
-      </w:r>
+      </w:r>
+      <w:r/>
     </w:p>
     <w:p>
       <w:pPr>
@@ -3047,6 +2967,12 @@
       </w:r>
     </w:p>
     <w:p>
+      <w:pPr/>
+      <w:r>
+        <w:t>Progression: Frontend Developer (Jul 2022 - Feb 2023) to Full-Stack Engineer (Feb 2023 - Jan 2026). Began with Wix CMS and a JavaScript/jQuery page integrating a Roboflow image-analysis API.</w:t>
+      </w:r>
+    </w:p>
+    <w:p>
       <w:pPr>
         <w:spacing w:before="15" w:line="360" w:lineRule="auto"/>
         <w:ind w:left="177" w:right="138"/>
@@ -3066,7 +2992,7 @@
           <w:sz w:val="20"/>
           <w:szCs w:val="20"/>
         </w:rPr>
-        <w:t>Dr Turbine | In-development Wind Turbine Inspection Platform</w:t>
+        <w:t>Dr Turbine | Pre-production wind turbine blade inspection platform | June 2025 - January 2026</w:t>
       </w:r>
     </w:p>
     <w:p>
@@ -3087,7 +3013,7 @@
           <w:sz w:val="20"/>
           <w:szCs w:val="20"/>
         </w:rPr>
-        <w:t>Pre-production platform; metrics reflect pilot/test workflow usage</w:t>
+        <w:t>Inspection workspace for drone imagery and structured blade review</w:t>
       </w:r>
     </w:p>
     <w:p>
@@ -3107,7 +3033,7 @@
           <w:sz w:val="20"/>
           <w:szCs w:val="20"/>
         </w:rPr>
-        <w:t xml:space="preserve">Stack: Next.js 15, React 19, TypeScript, Node.js, MySQL, Socket.IO, Prisma, </w:t>
+        <w:t>Stack: Next.js 15, React 18, TypeScript, PostgreSQL, Prisma, Sharp, exifr, Tailwind CSS</w:t>
       </w:r>
       <w:proofErr w:type="spellStart"/>
       <w:r>
@@ -3117,7 +3043,6 @@
           <w:sz w:val="20"/>
           <w:szCs w:val="20"/>
         </w:rPr>
-        <w:t>shadcn</w:t>
       </w:r>
       <w:proofErr w:type="spellEnd"/>
       <w:r>
@@ -3127,7 +3052,6 @@
           <w:sz w:val="20"/>
           <w:szCs w:val="20"/>
         </w:rPr>
-        <w:t>/</w:t>
       </w:r>
       <w:proofErr w:type="spellStart"/>
       <w:r>
@@ -3137,7 +3061,6 @@
           <w:sz w:val="20"/>
           <w:szCs w:val="20"/>
         </w:rPr>
-        <w:t>ui</w:t>
       </w:r>
       <w:proofErr w:type="spellEnd"/>
     </w:p>
@@ -3167,7 +3090,7 @@
           <w:sz w:val="20"/>
           <w:szCs w:val="20"/>
         </w:rPr>
-        <w:t>Built frontend architecture and image-review workflows for a pre-production inspection product handling 10,000+ drone images per month in pilot/test operations, supporting AI-assisted damage review with reported model accuracy up to 95% in testing.</w:t>
+        <w:t>Built an inspection workspace organizing drone imagery by wind park, turbine, blade, and blade section.</w:t>
       </w:r>
     </w:p>
     <w:p>
@@ -3196,7 +3119,7 @@
           <w:sz w:val="20"/>
           <w:szCs w:val="20"/>
         </w:rPr>
-        <w:t>Built real-time collaborative annotation workflows with Socket.IO, enabling 5+ concurrent inspectors to review and label imagery in the same workspace.</w:t>
+        <w:t>Developed image uploads with drone metadata extraction, GSD estimates, thumbnails, and PostgreSQL-backed inspection records.</w:t>
       </w:r>
     </w:p>
     <w:p>
@@ -3226,7 +3149,7 @@
           <w:sz w:val="20"/>
           <w:szCs w:val="20"/>
         </w:rPr>
-        <w:t xml:space="preserve">Optimized React rendering for large image datasets using lazy loading, virtualization, and Canvas-based </w:t>
+        <w:t>Implemented blade calibration and canvas-based review tools for defect annotations, measurements, and severity labels.</w:t>
       </w:r>
       <w:r>
         <w:rPr>
@@ -3236,16 +3159,14 @@
           <w:sz w:val="20"/>
           <w:szCs w:val="20"/>
         </w:rPr>
-        <w:t>overlays</w:t>
-      </w:r>
-      <w:r>
-        <w:rPr>
-          <w:rFonts w:ascii="Arial" w:hAnsi="Arial" w:cs="Arial"/>
-          <w:color w:val="1D283B"/>
-          <w:sz w:val="20"/>
-          <w:szCs w:val="20"/>
-        </w:rPr>
-        <w:t>.</w:t>
+      </w:r>
+      <w:r>
+        <w:rPr>
+          <w:rFonts w:ascii="Arial" w:hAnsi="Arial" w:cs="Arial"/>
+          <w:color w:val="1D283B"/>
+          <w:sz w:val="20"/>
+          <w:szCs w:val="20"/>
+        </w:rPr>
       </w:r>
     </w:p>
     <w:p>
@@ -3274,7 +3195,7 @@
           <w:sz w:val="20"/>
           <w:szCs w:val="20"/>
         </w:rPr>
-        <w:t>Automated drone-image metadata extraction and ingestion workflows, reducing manual data entry by 80% in internal inspection workflows.</w:t>
+        <w:t>Worked on APIs and data models for inspections, images, annotations, and calibration in a pre-production product.</w:t>
       </w:r>
     </w:p>
     <w:p>
@@ -3297,7 +3218,7 @@
           <w:sz w:val="20"/>
           <w:szCs w:val="20"/>
         </w:rPr>
-        <w:t>FILAHI | Production Precision Agriculture SaaS Platform</w:t>
+        <w:t>FILAHI | Production precision agriculture SaaS platform | February 2023 - June 2025</w:t>
       </w:r>
     </w:p>
     <w:p>
@@ -3317,7 +3238,23 @@
           <w:sz w:val="20"/>
           <w:szCs w:val="20"/>
         </w:rPr>
-        <w:t xml:space="preserve">Stack: Next.js, TypeScript, Node.js, MySQL, Prisma, </w:t>
+        <w:t>Stack: React, Next.js, TypeScript, Python, Django, MySQL, Leaflet.js</w:t>
+      </w:r>
+      <w:r>
+        <w:rPr>
+          <w:rFonts w:ascii="Arial" w:hAnsi="Arial" w:cs="Arial"/>
+          <w:color w:val="334154"/>
+          <w:sz w:val="20"/>
+          <w:szCs w:val="20"/>
+        </w:rPr>
+      </w:r>
+      <w:r>
+        <w:rPr>
+          <w:rFonts w:ascii="Arial" w:hAnsi="Arial" w:cs="Arial"/>
+          <w:color w:val="334154"/>
+          <w:sz w:val="20"/>
+          <w:szCs w:val="20"/>
+        </w:rPr>
       </w:r>
       <w:proofErr w:type="spellStart"/>
       <w:r>
@@ -3327,7 +3264,6 @@
           <w:sz w:val="20"/>
           <w:szCs w:val="20"/>
         </w:rPr>
-        <w:t>NextAuth</w:t>
       </w:r>
       <w:proofErr w:type="spellEnd"/>
       <w:r>
@@ -3337,7 +3273,6 @@
           <w:sz w:val="20"/>
           <w:szCs w:val="20"/>
         </w:rPr>
-        <w:t xml:space="preserve">, Leaflet.js, </w:t>
       </w:r>
       <w:proofErr w:type="spellStart"/>
       <w:r>
@@ -3347,7 +3282,6 @@
           <w:sz w:val="20"/>
           <w:szCs w:val="20"/>
         </w:rPr>
-        <w:t>shadcn</w:t>
       </w:r>
       <w:proofErr w:type="spellEnd"/>
       <w:r>
@@ -3357,7 +3291,6 @@
           <w:sz w:val="20"/>
           <w:szCs w:val="20"/>
         </w:rPr>
-        <w:t>/</w:t>
       </w:r>
       <w:proofErr w:type="spellStart"/>
       <w:r>
@@ -3367,7 +3300,6 @@
           <w:sz w:val="20"/>
           <w:szCs w:val="20"/>
         </w:rPr>
-        <w:t>ui</w:t>
       </w:r>
       <w:proofErr w:type="spellEnd"/>
     </w:p>
@@ -3397,7 +3329,7 @@
           <w:sz w:val="20"/>
           <w:szCs w:val="20"/>
         </w:rPr>
-        <w:t>Built and shipped production features for a precision-agriculture SaaS platform used by 500+ farmers managing 2,000+ plots, including geospatial workflows and AI-assisted crop analysis.</w:t>
+        <w:t>Helped evolve the agriculture prototype into FILAHI, first with React and a Python backend, then Next.js and Django; shipped features for 500+ farmers managing 10,000+ plots.</w:t>
       </w:r>
     </w:p>
     <w:p>
@@ -3426,7 +3358,7 @@
           <w:sz w:val="20"/>
           <w:szCs w:val="20"/>
         </w:rPr>
-        <w:t>Built interactive geospatial mapping and satellite-data visualization features using Leaflet.js for plot-level monitoring workflows.</w:t>
+        <w:t>Built interactive mapping and satellite-data views with Leaflet.js for plot-level monitoring and AI-assisted crop analysis.</w:t>
       </w:r>
     </w:p>
     <w:p>
@@ -3472,42 +3404,15 @@
       </w:pPr>
       <w:r>
         <w:rPr>
-          <w:rFonts w:ascii="Arial" w:hAnsi="Arial" w:cs="Arial"/>
           <w:b/>
-          <w:color w:val="1D283B"/>
-          <w:sz w:val="20"/>
-          <w:szCs w:val="20"/>
-        </w:rPr>
-        <w:t>Additional Projects:</w:t>
-      </w:r>
-      <w:r>
-        <w:rPr>
-          <w:rFonts w:ascii="Arial" w:hAnsi="Arial" w:cs="Arial"/>
-          <w:color w:val="1D283B"/>
-          <w:sz w:val="20"/>
-          <w:szCs w:val="20"/>
-        </w:rPr>
-        <w:t xml:space="preserve"> Built web, mobile (React Native/Expo), and desktop (Electron) applications with Node.js APIs, authentication, database-backed features, Playwright/Jest testing, GitHub/GitLab CI, and </w:t>
-      </w:r>
-      <w:proofErr w:type="spellStart"/>
-      <w:r>
-        <w:rPr>
-          <w:rFonts w:ascii="Arial" w:hAnsi="Arial" w:cs="Arial"/>
-          <w:color w:val="1D283B"/>
-          <w:sz w:val="20"/>
-          <w:szCs w:val="20"/>
-        </w:rPr>
-        <w:t>Vercel</w:t>
-      </w:r>
-      <w:proofErr w:type="spellEnd"/>
-      <w:r>
-        <w:rPr>
-          <w:rFonts w:ascii="Arial" w:hAnsi="Arial" w:cs="Arial"/>
-          <w:color w:val="1D283B"/>
-          <w:sz w:val="20"/>
-          <w:szCs w:val="20"/>
-        </w:rPr>
-        <w:t>/Nginx deployments.</w:t>
+        </w:rPr>
+        <w:t xml:space="preserve">Additional work: </w:t>
+      </w:r>
+      <w:r>
+        <w:rPr>
+          <w:b w:val="0"/>
+        </w:rPr>
+        <w:t>Built web, mobile (React Native/Expo), and desktop (Electron) applications; supported internal Windows, software, system, and network troubleshooting.</w:t>
       </w:r>
     </w:p>
     <w:p>
@@ -3598,7 +3503,6 @@
     <w:p>
       <w:pPr>
         <w:pStyle w:val="Heading2"/>
-        <w:keepNext/>
         <w:spacing w:before="240" w:line="480" w:lineRule="auto"/>
         <w:ind w:left="176"/>
         <w:rPr>
@@ -3663,16 +3567,7 @@
           <w:sz w:val="20"/>
           <w:szCs w:val="20"/>
         </w:rPr>
-        <w:t>IT Diploma |</w:t>
-      </w:r>
-      <w:r>
-        <w:rPr>
-          <w:rFonts w:ascii="Arial" w:hAnsi="Arial" w:cs="Arial"/>
-          <w:color w:val="1D283B"/>
-          <w:sz w:val="20"/>
-          <w:szCs w:val="20"/>
-        </w:rPr>
-        <w:t xml:space="preserve"> Office Software, IT Maintenance &amp; Networks | 2019</w:t>
+        <w:t>IT Diploma | Office Software, IT Maintenance &amp; Networks | 2019</w:t>
       </w:r>
     </w:p>
     <w:sectPr>
@@ -4367,7 +4262,6 @@
   <w:style w:type="character" w:default="1" w:styleId="DefaultParagraphFont">
     <w:name w:val="Default Paragraph Font"/>
     <w:uiPriority w:val="1"/>
-    <w:semiHidden/>
     <w:unhideWhenUsed/>
   </w:style>
   <w:style w:type="table" w:default="1" w:styleId="TableNormal">

</xml_diff>